<commit_message>
chore: 팀 레포 mobile/ 통합 대비 data/, .vscode/ 무시 해제, 개발 일지 20단계
Co-Authored-By: Claude Opus 5.5 <noreply@anthropic.com>
</commit_message>
<xml_diff>
--- a/docs/08_DEV_LOG.docx
+++ b/docs/08_DEV_LOG.docx
@@ -46,7 +46,7 @@
           <w:sz w:val="18"/>
           <w:szCs w:val="18"/>
         </w:rPr>
-        <w:t xml:space="preserve">최종 갱신 2026-10-19 · 총 19단계</w:t>
+        <w:t xml:space="preserve">최종 갱신 2026-10-19 · 총 20단계</w:t>
       </w:r>
     </w:p>
     <w:p>
@@ -2994,6 +2994,150 @@
           </w:p>
         </w:tc>
       </w:tr>
+      <w:tr>
+        <w:tc>
+          <w:tcPr>
+            <w:tcW w:type="dxa" w:w="691"/>
+            <w:tcBorders>
+              <w:top w:val="single" w:color="D9E1EE" w:sz="4"/>
+              <w:left w:val="single" w:color="D9E1EE" w:sz="4"/>
+              <w:bottom w:val="single" w:color="D9E1EE" w:sz="4"/>
+              <w:right w:val="single" w:color="D9E1EE" w:sz="4"/>
+            </w:tcBorders>
+            <w:tcMar>
+              <w:top w:type="dxa" w:w="60"/>
+              <w:left w:type="dxa" w:w="100"/>
+              <w:bottom w:type="dxa" w:w="60"/>
+              <w:right w:type="dxa" w:w="100"/>
+            </w:tcMar>
+          </w:tcPr>
+          <w:p>
+            <w:r>
+              <w:rPr>
+                <w:rFonts w:ascii="Malgun Gothic" w:cs="Malgun Gothic" w:eastAsia="Malgun Gothic" w:hAnsi="Malgun Gothic"/>
+                <w:color w:val="132238"/>
+                <w:sz w:val="18"/>
+                <w:szCs w:val="18"/>
+              </w:rPr>
+              <w:t xml:space="preserve">20</w:t>
+            </w:r>
+          </w:p>
+        </w:tc>
+        <w:tc>
+          <w:tcPr>
+            <w:tcW w:type="dxa" w:w="4736"/>
+            <w:tcBorders>
+              <w:top w:val="single" w:color="D9E1EE" w:sz="4"/>
+              <w:left w:val="single" w:color="D9E1EE" w:sz="4"/>
+              <w:bottom w:val="single" w:color="D9E1EE" w:sz="4"/>
+              <w:right w:val="single" w:color="D9E1EE" w:sz="4"/>
+            </w:tcBorders>
+            <w:tcMar>
+              <w:top w:type="dxa" w:w="60"/>
+              <w:left w:type="dxa" w:w="100"/>
+              <w:bottom w:type="dxa" w:w="60"/>
+              <w:right w:type="dxa" w:w="100"/>
+            </w:tcMar>
+          </w:tcPr>
+          <w:p>
+            <w:r>
+              <w:rPr>
+                <w:rFonts w:ascii="Malgun Gothic" w:cs="Malgun Gothic" w:eastAsia="Malgun Gothic" w:hAnsi="Malgun Gothic"/>
+                <w:color w:val="132238"/>
+                <w:sz w:val="18"/>
+                <w:szCs w:val="18"/>
+              </w:rPr>
+              <w:t xml:space="preserve">팀 레포 통합 준비 · AI 서버 API 분석</w:t>
+            </w:r>
+          </w:p>
+        </w:tc>
+        <w:tc>
+          <w:tcPr>
+            <w:tcW w:type="dxa" w:w="1381"/>
+            <w:tcBorders>
+              <w:top w:val="single" w:color="D9E1EE" w:sz="4"/>
+              <w:left w:val="single" w:color="D9E1EE" w:sz="4"/>
+              <w:bottom w:val="single" w:color="D9E1EE" w:sz="4"/>
+              <w:right w:val="single" w:color="D9E1EE" w:sz="4"/>
+            </w:tcBorders>
+            <w:tcMar>
+              <w:top w:type="dxa" w:w="60"/>
+              <w:left w:type="dxa" w:w="100"/>
+              <w:bottom w:type="dxa" w:w="60"/>
+              <w:right w:type="dxa" w:w="100"/>
+            </w:tcMar>
+          </w:tcPr>
+          <w:p>
+            <w:r>
+              <w:rPr>
+                <w:rFonts w:ascii="Malgun Gothic" w:cs="Malgun Gothic" w:eastAsia="Malgun Gothic" w:hAnsi="Malgun Gothic"/>
+                <w:color w:val="132238"/>
+                <w:sz w:val="18"/>
+                <w:szCs w:val="18"/>
+              </w:rPr>
+              <w:t xml:space="preserve">2026-10-19</w:t>
+            </w:r>
+          </w:p>
+        </w:tc>
+        <w:tc>
+          <w:tcPr>
+            <w:tcW w:type="dxa" w:w="1283"/>
+            <w:tcBorders>
+              <w:top w:val="single" w:color="D9E1EE" w:sz="4"/>
+              <w:left w:val="single" w:color="D9E1EE" w:sz="4"/>
+              <w:bottom w:val="single" w:color="D9E1EE" w:sz="4"/>
+              <w:right w:val="single" w:color="D9E1EE" w:sz="4"/>
+            </w:tcBorders>
+            <w:tcMar>
+              <w:top w:type="dxa" w:w="60"/>
+              <w:left w:type="dxa" w:w="100"/>
+              <w:bottom w:type="dxa" w:w="60"/>
+              <w:right w:type="dxa" w:w="100"/>
+            </w:tcMar>
+          </w:tcPr>
+          <w:p>
+            <w:r>
+              <w:rPr>
+                <w:rFonts w:ascii="Malgun Gothic" w:cs="Malgun Gothic" w:eastAsia="Malgun Gothic" w:hAnsi="Malgun Gothic"/>
+                <w:b/>
+                <w:bCs/>
+                <w:color w:val="246BFD"/>
+                <w:sz w:val="20"/>
+                <w:szCs w:val="20"/>
+              </w:rPr>
+              <w:t xml:space="preserve">[진행 중]</w:t>
+            </w:r>
+          </w:p>
+        </w:tc>
+        <w:tc>
+          <w:tcPr>
+            <w:tcW w:type="dxa" w:w="1775"/>
+            <w:tcBorders>
+              <w:top w:val="single" w:color="D9E1EE" w:sz="4"/>
+              <w:left w:val="single" w:color="D9E1EE" w:sz="4"/>
+              <w:bottom w:val="single" w:color="D9E1EE" w:sz="4"/>
+              <w:right w:val="single" w:color="D9E1EE" w:sz="4"/>
+            </w:tcBorders>
+            <w:tcMar>
+              <w:top w:type="dxa" w:w="60"/>
+              <w:left w:type="dxa" w:w="100"/>
+              <w:bottom w:type="dxa" w:w="60"/>
+              <w:right w:type="dxa" w:w="100"/>
+            </w:tcMar>
+          </w:tcPr>
+          <w:p>
+            <w:r>
+              <w:rPr>
+                <w:rFonts w:ascii="Malgun Gothic" w:cs="Malgun Gothic" w:eastAsia="Malgun Gothic" w:hAnsi="Malgun Gothic"/>
+                <w:color w:val="132238"/>
+                <w:sz w:val="18"/>
+                <w:szCs w:val="18"/>
+              </w:rPr>
+              <w:t xml:space="preserve">-</w:t>
+            </w:r>
+          </w:p>
+        </w:tc>
+      </w:tr>
     </w:tbl>
     <w:p>
       <w:pPr>
@@ -5015,6 +5159,122 @@
           </w:p>
         </w:tc>
       </w:tr>
+      <w:tr>
+        <w:tc>
+          <w:tcPr>
+            <w:tcW w:type="dxa" w:w="789"/>
+            <w:tcBorders>
+              <w:top w:val="single" w:color="D9E1EE" w:sz="4"/>
+              <w:left w:val="single" w:color="D9E1EE" w:sz="4"/>
+              <w:bottom w:val="single" w:color="D9E1EE" w:sz="4"/>
+              <w:right w:val="single" w:color="D9E1EE" w:sz="4"/>
+            </w:tcBorders>
+            <w:tcMar>
+              <w:top w:type="dxa" w:w="60"/>
+              <w:left w:type="dxa" w:w="100"/>
+              <w:bottom w:type="dxa" w:w="60"/>
+              <w:right w:type="dxa" w:w="100"/>
+            </w:tcMar>
+          </w:tcPr>
+          <w:p>
+            <w:r>
+              <w:rPr>
+                <w:rFonts w:ascii="Malgun Gothic" w:cs="Malgun Gothic" w:eastAsia="Malgun Gothic" w:hAnsi="Malgun Gothic"/>
+                <w:color w:val="132238"/>
+                <w:sz w:val="18"/>
+                <w:szCs w:val="18"/>
+              </w:rPr>
+              <w:t xml:space="preserve">20</w:t>
+            </w:r>
+          </w:p>
+        </w:tc>
+        <w:tc>
+          <w:tcPr>
+            <w:tcW w:type="dxa" w:w="3946"/>
+            <w:tcBorders>
+              <w:top w:val="single" w:color="D9E1EE" w:sz="4"/>
+              <w:left w:val="single" w:color="D9E1EE" w:sz="4"/>
+              <w:bottom w:val="single" w:color="D9E1EE" w:sz="4"/>
+              <w:right w:val="single" w:color="D9E1EE" w:sz="4"/>
+            </w:tcBorders>
+            <w:tcMar>
+              <w:top w:type="dxa" w:w="60"/>
+              <w:left w:type="dxa" w:w="100"/>
+              <w:bottom w:type="dxa" w:w="60"/>
+              <w:right w:type="dxa" w:w="100"/>
+            </w:tcMar>
+          </w:tcPr>
+          <w:p>
+            <w:r>
+              <w:rPr>
+                <w:rFonts w:ascii="Malgun Gothic" w:cs="Malgun Gothic" w:eastAsia="Malgun Gothic" w:hAnsi="Malgun Gothic"/>
+                <w:color w:val="132238"/>
+                <w:sz w:val="18"/>
+                <w:szCs w:val="18"/>
+              </w:rPr>
+              <w:t xml:space="preserve">장소 ID 체계가 AI 서버(카카오 ID), 백엔드 명세(googlePlaceId), 앱(네이버 지도)으로 서로 다름</w:t>
+            </w:r>
+          </w:p>
+        </w:tc>
+        <w:tc>
+          <w:tcPr>
+            <w:tcW w:type="dxa" w:w="3749"/>
+            <w:tcBorders>
+              <w:top w:val="single" w:color="D9E1EE" w:sz="4"/>
+              <w:left w:val="single" w:color="D9E1EE" w:sz="4"/>
+              <w:bottom w:val="single" w:color="D9E1EE" w:sz="4"/>
+              <w:right w:val="single" w:color="D9E1EE" w:sz="4"/>
+            </w:tcBorders>
+            <w:tcMar>
+              <w:top w:type="dxa" w:w="60"/>
+              <w:left w:type="dxa" w:w="100"/>
+              <w:bottom w:type="dxa" w:w="60"/>
+              <w:right w:type="dxa" w:w="100"/>
+            </w:tcMar>
+          </w:tcPr>
+          <w:p>
+            <w:r>
+              <w:rPr>
+                <w:rFonts w:ascii="Malgun Gothic" w:cs="Malgun Gothic" w:eastAsia="Malgun Gothic" w:hAnsi="Malgun Gothic"/>
+                <w:color w:val="132238"/>
+                <w:sz w:val="18"/>
+                <w:szCs w:val="18"/>
+              </w:rPr>
+              <w:t xml:space="preserve">팀 공통 장소 식별자와 추천 호출 경로(앱 → 백엔드 → AI 제안)를 팀에서 정하도록 보고</w:t>
+            </w:r>
+          </w:p>
+        </w:tc>
+        <w:tc>
+          <w:tcPr>
+            <w:tcW w:type="dxa" w:w="1382"/>
+            <w:tcBorders>
+              <w:top w:val="single" w:color="D9E1EE" w:sz="4"/>
+              <w:left w:val="single" w:color="D9E1EE" w:sz="4"/>
+              <w:bottom w:val="single" w:color="D9E1EE" w:sz="4"/>
+              <w:right w:val="single" w:color="D9E1EE" w:sz="4"/>
+            </w:tcBorders>
+            <w:tcMar>
+              <w:top w:type="dxa" w:w="60"/>
+              <w:left w:type="dxa" w:w="100"/>
+              <w:bottom w:type="dxa" w:w="60"/>
+              <w:right w:type="dxa" w:w="100"/>
+            </w:tcMar>
+          </w:tcPr>
+          <w:p>
+            <w:r>
+              <w:rPr>
+                <w:rFonts w:ascii="Malgun Gothic" w:cs="Malgun Gothic" w:eastAsia="Malgun Gothic" w:hAnsi="Malgun Gothic"/>
+                <w:b/>
+                <w:bCs/>
+                <w:color w:val="F39A45"/>
+                <w:sz w:val="20"/>
+                <w:szCs w:val="20"/>
+              </w:rPr>
+              <w:t xml:space="preserve">[결정 대기]</w:t>
+            </w:r>
+          </w:p>
+        </w:tc>
+      </w:tr>
     </w:tbl>
     <w:p>
       <w:pPr>
@@ -5600,6 +5860,63 @@
           <w:szCs w:val="20"/>
         </w:rPr>
         <w:t xml:space="preserve">(19단계) 참고: 위치를 받기 전 첫 화면에 Mock 고정 문구 "도보 5분"이 잠깐 보이고, 먼 거리는 "9073.5km"처럼 소수점까지 표시됨</w:t>
+      </w:r>
+    </w:p>
+    <w:p>
+      <w:pPr>
+        <w:pStyle w:val="ListParagraph"/>
+        <w:numPr>
+          <w:ilvl w:val="0"/>
+          <w:numId w:val="2"/>
+        </w:numPr>
+        <w:spacing w:after="40"/>
+      </w:pPr>
+      <w:r>
+        <w:rPr>
+          <w:rFonts w:ascii="Malgun Gothic" w:cs="Malgun Gothic" w:eastAsia="Malgun Gothic" w:hAnsi="Malgun Gothic"/>
+          <w:color w:val="132238"/>
+          <w:sz w:val="20"/>
+          <w:szCs w:val="20"/>
+        </w:rPr>
+        <w:t xml:space="preserve">(20단계) 팀 레포에 subtree add·브랜치 push·PR (사용자 허락 후)</w:t>
+      </w:r>
+    </w:p>
+    <w:p>
+      <w:pPr>
+        <w:pStyle w:val="ListParagraph"/>
+        <w:numPr>
+          <w:ilvl w:val="0"/>
+          <w:numId w:val="2"/>
+        </w:numPr>
+        <w:spacing w:after="40"/>
+      </w:pPr>
+      <w:r>
+        <w:rPr>
+          <w:rFonts w:ascii="Malgun Gothic" w:cs="Malgun Gothic" w:eastAsia="Malgun Gothic" w:hAnsi="Malgun Gothic"/>
+          <w:color w:val="132238"/>
+          <w:sz w:val="20"/>
+          <w:szCs w:val="20"/>
+        </w:rPr>
+        <w:t xml:space="preserve">(20단계) 합친 뒤 작업 흐름(팀 레포 mobile/에서 개발 vs 앱 레포 유지) 결정</w:t>
+      </w:r>
+    </w:p>
+    <w:p>
+      <w:pPr>
+        <w:pStyle w:val="ListParagraph"/>
+        <w:numPr>
+          <w:ilvl w:val="0"/>
+          <w:numId w:val="2"/>
+        </w:numPr>
+        <w:spacing w:after="40"/>
+      </w:pPr>
+      <w:r>
+        <w:rPr>
+          <w:rFonts w:ascii="Malgun Gothic" w:cs="Malgun Gothic" w:eastAsia="Malgun Gothic" w:hAnsi="Malgun Gothic"/>
+          <w:color w:val="132238"/>
+          <w:sz w:val="20"/>
+          <w:szCs w:val="20"/>
+        </w:rPr>
+        <w:t xml:space="preserve">(20단계) AI 서버 API와 앱 입력·출력 차이(area, 분위기·날짜, 제외 목록, 이동 정보, 최대 6곳, 600초 대기) 팀 합의</w:t>
       </w:r>
     </w:p>
     <w:p>
@@ -17659,6 +17976,686 @@
           <w:szCs w:val="20"/>
         </w:rPr>
         <w:t xml:space="preserve">참고: 위치를 받기 전 첫 화면에 Mock 고정 문구 "도보 5분"이 잠깐 보이고, 먼 거리는 "9073.5km"처럼 소수점까지 표시됨</w:t>
+      </w:r>
+    </w:p>
+    <w:p>
+      <w:pPr>
+        <w:pStyle w:val="Heading2"/>
+        <w:spacing w:after="80" w:before="360"/>
+      </w:pPr>
+      <w:r>
+        <w:rPr>
+          <w:rFonts w:ascii="Malgun Gothic" w:cs="Malgun Gothic" w:eastAsia="Malgun Gothic" w:hAnsi="Malgun Gothic"/>
+          <w:b/>
+          <w:bCs/>
+          <w:color w:val="132238"/>
+          <w:sz w:val="26"/>
+          <w:szCs w:val="26"/>
+        </w:rPr>
+        <w:t xml:space="preserve">20단계. 팀 레포 통합 준비 · AI 서버 API 분석</w:t>
+      </w:r>
+    </w:p>
+    <w:p>
+      <w:pPr>
+        <w:spacing w:after="80" w:before="0"/>
+      </w:pPr>
+      <w:r>
+        <w:rPr>
+          <w:rFonts w:ascii="Malgun Gothic" w:cs="Malgun Gothic" w:eastAsia="Malgun Gothic" w:hAnsi="Malgun Gothic"/>
+          <w:color w:val="7B8AA3"/>
+          <w:sz w:val="18"/>
+          <w:szCs w:val="18"/>
+        </w:rPr>
+        <w:t xml:space="preserve">2026-10-19   </w:t>
+      </w:r>
+      <w:r>
+        <w:rPr>
+          <w:rFonts w:ascii="Malgun Gothic" w:cs="Malgun Gothic" w:eastAsia="Malgun Gothic" w:hAnsi="Malgun Gothic"/>
+          <w:b/>
+          <w:bCs/>
+          <w:color w:val="246BFD"/>
+          <w:sz w:val="20"/>
+          <w:szCs w:val="20"/>
+        </w:rPr>
+        <w:t xml:space="preserve">[진행 중]</w:t>
+      </w:r>
+      <w:r>
+        <w:rPr>
+          <w:rFonts w:ascii="Malgun Gothic" w:cs="Malgun Gothic" w:eastAsia="Malgun Gothic" w:hAnsi="Malgun Gothic"/>
+          <w:color w:val="7B8AA3"/>
+          <w:sz w:val="18"/>
+          <w:szCs w:val="18"/>
+        </w:rPr>
+        <w:t xml:space="preserve">   (코드 변경 없음)</w:t>
+      </w:r>
+    </w:p>
+    <w:p>
+      <w:pPr>
+        <w:spacing w:after="80" w:before="0"/>
+      </w:pPr>
+      <w:r>
+        <w:rPr>
+          <w:rFonts w:ascii="Malgun Gothic" w:cs="Malgun Gothic" w:eastAsia="Malgun Gothic" w:hAnsi="Malgun Gothic"/>
+          <w:color w:val="7B8AA3"/>
+          <w:sz w:val="20"/>
+          <w:szCs w:val="20"/>
+        </w:rPr>
+        <w:t xml:space="preserve">앱 레포를 AI·백엔드와 같이 쓰는 팀 레포(jim-min/Agentic-Personal-Travelassistant)의 mobile/ 폴더로 커밋 기록째 합칠 준비를 한다.</w:t>
+      </w:r>
+    </w:p>
+    <w:p>
+      <w:pPr>
+        <w:spacing w:after="60" w:before="160"/>
+      </w:pPr>
+      <w:r>
+        <w:rPr>
+          <w:rFonts w:ascii="Malgun Gothic" w:cs="Malgun Gothic" w:eastAsia="Malgun Gothic" w:hAnsi="Malgun Gothic"/>
+          <w:b/>
+          <w:bCs/>
+          <w:color w:val="246BFD"/>
+          <w:sz w:val="21"/>
+          <w:szCs w:val="21"/>
+        </w:rPr>
+        <w:t xml:space="preserve">작업 내용</w:t>
+      </w:r>
+    </w:p>
+    <w:p>
+      <w:pPr>
+        <w:pStyle w:val="ListParagraph"/>
+        <w:numPr>
+          <w:ilvl w:val="0"/>
+          <w:numId w:val="2"/>
+        </w:numPr>
+        <w:spacing w:after="40"/>
+      </w:pPr>
+      <w:r>
+        <w:rPr>
+          <w:rFonts w:ascii="Malgun Gothic" w:cs="Malgun Gothic" w:eastAsia="Malgun Gothic" w:hAnsi="Malgun Gothic"/>
+          <w:color w:val="132238"/>
+          <w:sz w:val="20"/>
+          <w:szCs w:val="20"/>
+        </w:rPr>
+        <w:t xml:space="preserve">통합 테스트 A–J 10개 Pixel_6_Pro에서 재실행 → 전부 통과</w:t>
+      </w:r>
+    </w:p>
+    <w:p>
+      <w:pPr>
+        <w:pStyle w:val="ListParagraph"/>
+        <w:numPr>
+          <w:ilvl w:val="0"/>
+          <w:numId w:val="2"/>
+        </w:numPr>
+        <w:spacing w:after="40"/>
+      </w:pPr>
+      <w:r>
+        <w:rPr>
+          <w:rFonts w:ascii="Malgun Gothic" w:cs="Malgun Gothic" w:eastAsia="Malgun Gothic" w:hAnsi="Malgun Gothic"/>
+          <w:color w:val="132238"/>
+          <w:sz w:val="20"/>
+          <w:szCs w:val="20"/>
+        </w:rPr>
+        <w:t xml:space="preserve">팀 레포 구조 확인(읽기 전용): FastAPI AI 서버(api.py, src/), Vite 웹 데모(frontend/) → 앱은 mobile/에 넣기로 제안</w:t>
+      </w:r>
+    </w:p>
+    <w:p>
+      <w:pPr>
+        <w:pStyle w:val="ListParagraph"/>
+        <w:numPr>
+          <w:ilvl w:val="0"/>
+          <w:numId w:val="2"/>
+        </w:numPr>
+        <w:spacing w:after="40"/>
+      </w:pPr>
+      <w:r>
+        <w:rPr>
+          <w:rFonts w:ascii="Malgun Gothic" w:cs="Malgun Gothic" w:eastAsia="Malgun Gothic" w:hAnsi="Malgun Gothic"/>
+          <w:color w:val="132238"/>
+          <w:sz w:val="20"/>
+          <w:szCs w:val="20"/>
+        </w:rPr>
+        <w:t xml:space="preserve">AI 서버 API(/health, /places/search, /recommend)를 앱 CourseRepository·백엔드 명세와 비교 분석</w:t>
+      </w:r>
+    </w:p>
+    <w:p>
+      <w:pPr>
+        <w:pStyle w:val="ListParagraph"/>
+        <w:numPr>
+          <w:ilvl w:val="0"/>
+          <w:numId w:val="2"/>
+        </w:numPr>
+        <w:spacing w:after="40"/>
+      </w:pPr>
+      <w:r>
+        <w:rPr>
+          <w:rFonts w:ascii="Malgun Gothic" w:cs="Malgun Gothic" w:eastAsia="Malgun Gothic" w:hAnsi="Malgun Gothic"/>
+          <w:color w:val="132238"/>
+          <w:sz w:val="20"/>
+          <w:szCs w:val="20"/>
+        </w:rPr>
+        <w:t xml:space="preserve">임시 복사본에서 git subtree add --prefix=mobile 모의 실행: 앱 커밋 기록·작성 시각 그대로 유지, 겹치는 파일 없음, 커밋 기록에 키 없음 확인</w:t>
+      </w:r>
+    </w:p>
+    <w:p>
+      <w:pPr>
+        <w:pStyle w:val="ListParagraph"/>
+        <w:numPr>
+          <w:ilvl w:val="0"/>
+          <w:numId w:val="2"/>
+        </w:numPr>
+        <w:spacing w:after="40"/>
+      </w:pPr>
+      <w:r>
+        <w:rPr>
+          <w:rFonts w:ascii="Malgun Gothic" w:cs="Malgun Gothic" w:eastAsia="Malgun Gothic" w:hAnsi="Malgun Gothic"/>
+          <w:color w:val="132238"/>
+          <w:sz w:val="20"/>
+          <w:szCs w:val="20"/>
+        </w:rPr>
+        <w:t xml:space="preserve">.gitignore에 !data/, !.vscode/ 추가 (현재 앱 레포에서는 효과 없음, 합친 뒤 mobile/ 안에서만 적용)</w:t>
+      </w:r>
+    </w:p>
+    <w:p>
+      <w:pPr>
+        <w:spacing w:after="60" w:before="160"/>
+      </w:pPr>
+      <w:r>
+        <w:rPr>
+          <w:rFonts w:ascii="Malgun Gothic" w:cs="Malgun Gothic" w:eastAsia="Malgun Gothic" w:hAnsi="Malgun Gothic"/>
+          <w:b/>
+          <w:bCs/>
+          <w:color w:val="246BFD"/>
+          <w:sz w:val="21"/>
+          <w:szCs w:val="21"/>
+        </w:rPr>
+        <w:t xml:space="preserve">발생한 문제와 해결 방법</w:t>
+      </w:r>
+    </w:p>
+    <w:tbl>
+      <w:tblPr>
+        <w:tblW w:type="dxa" w:w="9866"/>
+        <w:tblBorders>
+          <w:top w:val="single" w:color="auto" w:sz="4"/>
+          <w:left w:val="single" w:color="auto" w:sz="4"/>
+          <w:bottom w:val="single" w:color="auto" w:sz="4"/>
+          <w:right w:val="single" w:color="auto" w:sz="4"/>
+          <w:insideH w:val="single" w:color="auto" w:sz="4"/>
+          <w:insideV w:val="single" w:color="auto" w:sz="4"/>
+        </w:tblBorders>
+      </w:tblPr>
+      <w:tblGrid>
+        <w:gridCol w:w="2762"/>
+        <w:gridCol w:w="2467"/>
+        <w:gridCol w:w="3453"/>
+        <w:gridCol w:w="1184"/>
+      </w:tblGrid>
+      <w:tr>
+        <w:trPr>
+          <w:tblHeader/>
+        </w:trPr>
+        <w:tc>
+          <w:tcPr>
+            <w:tcW w:type="dxa" w:w="2762"/>
+            <w:tcBorders>
+              <w:top w:val="single" w:color="D9E1EE" w:sz="4"/>
+              <w:left w:val="single" w:color="D9E1EE" w:sz="4"/>
+              <w:bottom w:val="single" w:color="D9E1EE" w:sz="4"/>
+              <w:right w:val="single" w:color="D9E1EE" w:sz="4"/>
+            </w:tcBorders>
+            <w:shd w:fill="EEF3FF" w:color="auto" w:val="clear"/>
+            <w:tcMar>
+              <w:top w:type="dxa" w:w="60"/>
+              <w:left w:type="dxa" w:w="100"/>
+              <w:bottom w:type="dxa" w:w="60"/>
+              <w:right w:type="dxa" w:w="100"/>
+            </w:tcMar>
+          </w:tcPr>
+          <w:p>
+            <w:r>
+              <w:rPr>
+                <w:rFonts w:ascii="Malgun Gothic" w:cs="Malgun Gothic" w:eastAsia="Malgun Gothic" w:hAnsi="Malgun Gothic"/>
+                <w:b/>
+                <w:bCs/>
+                <w:color w:val="132238"/>
+                <w:sz w:val="18"/>
+                <w:szCs w:val="18"/>
+              </w:rPr>
+              <w:t xml:space="preserve">문제</w:t>
+            </w:r>
+          </w:p>
+        </w:tc>
+        <w:tc>
+          <w:tcPr>
+            <w:tcW w:type="dxa" w:w="2467"/>
+            <w:tcBorders>
+              <w:top w:val="single" w:color="D9E1EE" w:sz="4"/>
+              <w:left w:val="single" w:color="D9E1EE" w:sz="4"/>
+              <w:bottom w:val="single" w:color="D9E1EE" w:sz="4"/>
+              <w:right w:val="single" w:color="D9E1EE" w:sz="4"/>
+            </w:tcBorders>
+            <w:shd w:fill="EEF3FF" w:color="auto" w:val="clear"/>
+            <w:tcMar>
+              <w:top w:type="dxa" w:w="60"/>
+              <w:left w:type="dxa" w:w="100"/>
+              <w:bottom w:type="dxa" w:w="60"/>
+              <w:right w:type="dxa" w:w="100"/>
+            </w:tcMar>
+          </w:tcPr>
+          <w:p>
+            <w:r>
+              <w:rPr>
+                <w:rFonts w:ascii="Malgun Gothic" w:cs="Malgun Gothic" w:eastAsia="Malgun Gothic" w:hAnsi="Malgun Gothic"/>
+                <w:b/>
+                <w:bCs/>
+                <w:color w:val="132238"/>
+                <w:sz w:val="18"/>
+                <w:szCs w:val="18"/>
+              </w:rPr>
+              <w:t xml:space="preserve">원인</w:t>
+            </w:r>
+          </w:p>
+        </w:tc>
+        <w:tc>
+          <w:tcPr>
+            <w:tcW w:type="dxa" w:w="3453"/>
+            <w:tcBorders>
+              <w:top w:val="single" w:color="D9E1EE" w:sz="4"/>
+              <w:left w:val="single" w:color="D9E1EE" w:sz="4"/>
+              <w:bottom w:val="single" w:color="D9E1EE" w:sz="4"/>
+              <w:right w:val="single" w:color="D9E1EE" w:sz="4"/>
+            </w:tcBorders>
+            <w:shd w:fill="EEF3FF" w:color="auto" w:val="clear"/>
+            <w:tcMar>
+              <w:top w:type="dxa" w:w="60"/>
+              <w:left w:type="dxa" w:w="100"/>
+              <w:bottom w:type="dxa" w:w="60"/>
+              <w:right w:type="dxa" w:w="100"/>
+            </w:tcMar>
+          </w:tcPr>
+          <w:p>
+            <w:r>
+              <w:rPr>
+                <w:rFonts w:ascii="Malgun Gothic" w:cs="Malgun Gothic" w:eastAsia="Malgun Gothic" w:hAnsi="Malgun Gothic"/>
+                <w:b/>
+                <w:bCs/>
+                <w:color w:val="132238"/>
+                <w:sz w:val="18"/>
+                <w:szCs w:val="18"/>
+              </w:rPr>
+              <w:t xml:space="preserve">해결 / 제안</w:t>
+            </w:r>
+          </w:p>
+        </w:tc>
+        <w:tc>
+          <w:tcPr>
+            <w:tcW w:type="dxa" w:w="1184"/>
+            <w:tcBorders>
+              <w:top w:val="single" w:color="D9E1EE" w:sz="4"/>
+              <w:left w:val="single" w:color="D9E1EE" w:sz="4"/>
+              <w:bottom w:val="single" w:color="D9E1EE" w:sz="4"/>
+              <w:right w:val="single" w:color="D9E1EE" w:sz="4"/>
+            </w:tcBorders>
+            <w:shd w:fill="EEF3FF" w:color="auto" w:val="clear"/>
+            <w:tcMar>
+              <w:top w:type="dxa" w:w="60"/>
+              <w:left w:type="dxa" w:w="100"/>
+              <w:bottom w:type="dxa" w:w="60"/>
+              <w:right w:type="dxa" w:w="100"/>
+            </w:tcMar>
+          </w:tcPr>
+          <w:p>
+            <w:r>
+              <w:rPr>
+                <w:rFonts w:ascii="Malgun Gothic" w:cs="Malgun Gothic" w:eastAsia="Malgun Gothic" w:hAnsi="Malgun Gothic"/>
+                <w:b/>
+                <w:bCs/>
+                <w:color w:val="132238"/>
+                <w:sz w:val="18"/>
+                <w:szCs w:val="18"/>
+              </w:rPr>
+              <w:t xml:space="preserve">상태</w:t>
+            </w:r>
+          </w:p>
+        </w:tc>
+      </w:tr>
+      <w:tr>
+        <w:tc>
+          <w:tcPr>
+            <w:tcW w:type="dxa" w:w="2762"/>
+            <w:tcBorders>
+              <w:top w:val="single" w:color="D9E1EE" w:sz="4"/>
+              <w:left w:val="single" w:color="D9E1EE" w:sz="4"/>
+              <w:bottom w:val="single" w:color="D9E1EE" w:sz="4"/>
+              <w:right w:val="single" w:color="D9E1EE" w:sz="4"/>
+            </w:tcBorders>
+            <w:tcMar>
+              <w:top w:type="dxa" w:w="60"/>
+              <w:left w:type="dxa" w:w="100"/>
+              <w:bottom w:type="dxa" w:w="60"/>
+              <w:right w:type="dxa" w:w="100"/>
+            </w:tcMar>
+          </w:tcPr>
+          <w:p>
+            <w:r>
+              <w:rPr>
+                <w:rFonts w:ascii="Malgun Gothic" w:cs="Malgun Gothic" w:eastAsia="Malgun Gothic" w:hAnsi="Malgun Gothic"/>
+                <w:color w:val="132238"/>
+                <w:sz w:val="18"/>
+                <w:szCs w:val="18"/>
+              </w:rPr>
+              <w:t xml:space="preserve">팀 루트 .gitignore의 data/, .vscode/가 mobile/ 안까지 적용됨</w:t>
+            </w:r>
+          </w:p>
+        </w:tc>
+        <w:tc>
+          <w:tcPr>
+            <w:tcW w:type="dxa" w:w="2467"/>
+            <w:tcBorders>
+              <w:top w:val="single" w:color="D9E1EE" w:sz="4"/>
+              <w:left w:val="single" w:color="D9E1EE" w:sz="4"/>
+              <w:bottom w:val="single" w:color="D9E1EE" w:sz="4"/>
+              <w:right w:val="single" w:color="D9E1EE" w:sz="4"/>
+            </w:tcBorders>
+            <w:tcMar>
+              <w:top w:type="dxa" w:w="60"/>
+              <w:left w:type="dxa" w:w="100"/>
+              <w:bottom w:type="dxa" w:w="60"/>
+              <w:right w:type="dxa" w:w="100"/>
+            </w:tcMar>
+          </w:tcPr>
+          <w:p>
+            <w:r>
+              <w:rPr>
+                <w:rFonts w:ascii="Malgun Gothic" w:cs="Malgun Gothic" w:eastAsia="Malgun Gothic" w:hAnsi="Malgun Gothic"/>
+                <w:color w:val="132238"/>
+                <w:sz w:val="18"/>
+                <w:szCs w:val="18"/>
+              </w:rPr>
+              <w:t xml:space="preserve">앞에 /가 없는 패턴은 모든 깊이의 같은 이름 폴더에 적용 → lib/features/*/data/, .vscode/launch.json이 무시 대상</w:t>
+            </w:r>
+          </w:p>
+        </w:tc>
+        <w:tc>
+          <w:tcPr>
+            <w:tcW w:type="dxa" w:w="3453"/>
+            <w:tcBorders>
+              <w:top w:val="single" w:color="D9E1EE" w:sz="4"/>
+              <w:left w:val="single" w:color="D9E1EE" w:sz="4"/>
+              <w:bottom w:val="single" w:color="D9E1EE" w:sz="4"/>
+              <w:right w:val="single" w:color="D9E1EE" w:sz="4"/>
+            </w:tcBorders>
+            <w:tcMar>
+              <w:top w:type="dxa" w:w="60"/>
+              <w:left w:type="dxa" w:w="100"/>
+              <w:bottom w:type="dxa" w:w="60"/>
+              <w:right w:type="dxa" w:w="100"/>
+            </w:tcMar>
+          </w:tcPr>
+          <w:p>
+            <w:r>
+              <w:rPr>
+                <w:rFonts w:ascii="Malgun Gothic" w:cs="Malgun Gothic" w:eastAsia="Malgun Gothic" w:hAnsi="Malgun Gothic"/>
+                <w:color w:val="132238"/>
+                <w:sz w:val="18"/>
+                <w:szCs w:val="18"/>
+              </w:rPr>
+              <w:t xml:space="preserve">앱 .gitignore(합친 뒤 mobile/.gitignore)에서 !data/, !.vscode/로 무시 해제. 팀 루트 파일은 수정하지 않음. 모의 실행에서 무시되는 관리 파일 13개 → 0개, data/ 새 파일 정상 인식 확인</w:t>
+            </w:r>
+          </w:p>
+        </w:tc>
+        <w:tc>
+          <w:tcPr>
+            <w:tcW w:type="dxa" w:w="1184"/>
+            <w:tcBorders>
+              <w:top w:val="single" w:color="D9E1EE" w:sz="4"/>
+              <w:left w:val="single" w:color="D9E1EE" w:sz="4"/>
+              <w:bottom w:val="single" w:color="D9E1EE" w:sz="4"/>
+              <w:right w:val="single" w:color="D9E1EE" w:sz="4"/>
+            </w:tcBorders>
+            <w:tcMar>
+              <w:top w:type="dxa" w:w="60"/>
+              <w:left w:type="dxa" w:w="100"/>
+              <w:bottom w:type="dxa" w:w="60"/>
+              <w:right w:type="dxa" w:w="100"/>
+            </w:tcMar>
+          </w:tcPr>
+          <w:p>
+            <w:r>
+              <w:rPr>
+                <w:rFonts w:ascii="Malgun Gothic" w:cs="Malgun Gothic" w:eastAsia="Malgun Gothic" w:hAnsi="Malgun Gothic"/>
+                <w:b/>
+                <w:bCs/>
+                <w:color w:val="2E9E6A"/>
+                <w:sz w:val="20"/>
+                <w:szCs w:val="20"/>
+              </w:rPr>
+              <w:t xml:space="preserve">[해결]</w:t>
+            </w:r>
+          </w:p>
+        </w:tc>
+      </w:tr>
+      <w:tr>
+        <w:tc>
+          <w:tcPr>
+            <w:tcW w:type="dxa" w:w="2762"/>
+            <w:tcBorders>
+              <w:top w:val="single" w:color="D9E1EE" w:sz="4"/>
+              <w:left w:val="single" w:color="D9E1EE" w:sz="4"/>
+              <w:bottom w:val="single" w:color="D9E1EE" w:sz="4"/>
+              <w:right w:val="single" w:color="D9E1EE" w:sz="4"/>
+            </w:tcBorders>
+            <w:tcMar>
+              <w:top w:type="dxa" w:w="60"/>
+              <w:left w:type="dxa" w:w="100"/>
+              <w:bottom w:type="dxa" w:w="60"/>
+              <w:right w:type="dxa" w:w="100"/>
+            </w:tcMar>
+          </w:tcPr>
+          <w:p>
+            <w:r>
+              <w:rPr>
+                <w:rFonts w:ascii="Malgun Gothic" w:cs="Malgun Gothic" w:eastAsia="Malgun Gothic" w:hAnsi="Malgun Gothic"/>
+                <w:color w:val="132238"/>
+                <w:sz w:val="18"/>
+                <w:szCs w:val="18"/>
+              </w:rPr>
+              <w:t xml:space="preserve">장소 ID 체계가 AI 서버(카카오 ID), 백엔드 명세(googlePlaceId), 앱(네이버 지도)으로 서로 다름</w:t>
+            </w:r>
+          </w:p>
+        </w:tc>
+        <w:tc>
+          <w:tcPr>
+            <w:tcW w:type="dxa" w:w="2467"/>
+            <w:tcBorders>
+              <w:top w:val="single" w:color="D9E1EE" w:sz="4"/>
+              <w:left w:val="single" w:color="D9E1EE" w:sz="4"/>
+              <w:bottom w:val="single" w:color="D9E1EE" w:sz="4"/>
+              <w:right w:val="single" w:color="D9E1EE" w:sz="4"/>
+            </w:tcBorders>
+            <w:tcMar>
+              <w:top w:type="dxa" w:w="60"/>
+              <w:left w:type="dxa" w:w="100"/>
+              <w:bottom w:type="dxa" w:w="60"/>
+              <w:right w:type="dxa" w:w="100"/>
+            </w:tcMar>
+          </w:tcPr>
+          <w:p>
+            <w:r>
+              <w:rPr>
+                <w:rFonts w:ascii="Malgun Gothic" w:cs="Malgun Gothic" w:eastAsia="Malgun Gothic" w:hAnsi="Malgun Gothic"/>
+                <w:color w:val="132238"/>
+                <w:sz w:val="18"/>
+                <w:szCs w:val="18"/>
+              </w:rPr>
+              <w:t xml:space="preserve">세 역할이 각자 지도·장소 API를 고름</w:t>
+            </w:r>
+          </w:p>
+        </w:tc>
+        <w:tc>
+          <w:tcPr>
+            <w:tcW w:type="dxa" w:w="3453"/>
+            <w:tcBorders>
+              <w:top w:val="single" w:color="D9E1EE" w:sz="4"/>
+              <w:left w:val="single" w:color="D9E1EE" w:sz="4"/>
+              <w:bottom w:val="single" w:color="D9E1EE" w:sz="4"/>
+              <w:right w:val="single" w:color="D9E1EE" w:sz="4"/>
+            </w:tcBorders>
+            <w:tcMar>
+              <w:top w:type="dxa" w:w="60"/>
+              <w:left w:type="dxa" w:w="100"/>
+              <w:bottom w:type="dxa" w:w="60"/>
+              <w:right w:type="dxa" w:w="100"/>
+            </w:tcMar>
+          </w:tcPr>
+          <w:p>
+            <w:r>
+              <w:rPr>
+                <w:rFonts w:ascii="Malgun Gothic" w:cs="Malgun Gothic" w:eastAsia="Malgun Gothic" w:hAnsi="Malgun Gothic"/>
+                <w:color w:val="132238"/>
+                <w:sz w:val="18"/>
+                <w:szCs w:val="18"/>
+              </w:rPr>
+              <w:t xml:space="preserve">팀 공통 장소 식별자와 추천 호출 경로(앱 → 백엔드 → AI 제안)를 팀에서 정하도록 보고</w:t>
+            </w:r>
+          </w:p>
+        </w:tc>
+        <w:tc>
+          <w:tcPr>
+            <w:tcW w:type="dxa" w:w="1184"/>
+            <w:tcBorders>
+              <w:top w:val="single" w:color="D9E1EE" w:sz="4"/>
+              <w:left w:val="single" w:color="D9E1EE" w:sz="4"/>
+              <w:bottom w:val="single" w:color="D9E1EE" w:sz="4"/>
+              <w:right w:val="single" w:color="D9E1EE" w:sz="4"/>
+            </w:tcBorders>
+            <w:tcMar>
+              <w:top w:type="dxa" w:w="60"/>
+              <w:left w:type="dxa" w:w="100"/>
+              <w:bottom w:type="dxa" w:w="60"/>
+              <w:right w:type="dxa" w:w="100"/>
+            </w:tcMar>
+          </w:tcPr>
+          <w:p>
+            <w:r>
+              <w:rPr>
+                <w:rFonts w:ascii="Malgun Gothic" w:cs="Malgun Gothic" w:eastAsia="Malgun Gothic" w:hAnsi="Malgun Gothic"/>
+                <w:b/>
+                <w:bCs/>
+                <w:color w:val="F39A45"/>
+                <w:sz w:val="20"/>
+                <w:szCs w:val="20"/>
+              </w:rPr>
+              <w:t xml:space="preserve">[결정 대기]</w:t>
+            </w:r>
+          </w:p>
+        </w:tc>
+      </w:tr>
+    </w:tbl>
+    <w:p>
+      <w:pPr>
+        <w:spacing w:after="60" w:before="160"/>
+      </w:pPr>
+      <w:r>
+        <w:rPr>
+          <w:rFonts w:ascii="Malgun Gothic" w:cs="Malgun Gothic" w:eastAsia="Malgun Gothic" w:hAnsi="Malgun Gothic"/>
+          <w:b/>
+          <w:bCs/>
+          <w:color w:val="246BFD"/>
+          <w:sz w:val="21"/>
+          <w:szCs w:val="21"/>
+        </w:rPr>
+        <w:t xml:space="preserve">결정 사항</w:t>
+      </w:r>
+    </w:p>
+    <w:p>
+      <w:pPr>
+        <w:pStyle w:val="ListParagraph"/>
+        <w:numPr>
+          <w:ilvl w:val="0"/>
+          <w:numId w:val="2"/>
+        </w:numPr>
+        <w:spacing w:after="40"/>
+      </w:pPr>
+      <w:r>
+        <w:rPr>
+          <w:rFonts w:ascii="Malgun Gothic" w:cs="Malgun Gothic" w:eastAsia="Malgun Gothic" w:hAnsi="Malgun Gothic"/>
+          <w:color w:val="132238"/>
+          <w:sz w:val="20"/>
+          <w:szCs w:val="20"/>
+        </w:rPr>
+        <w:t xml:space="preserve">통합 방식: git subtree add로 커밋 기록째 mobile/에 합치고, 브랜치 push 후 PR로 올린다 (팀 레포 main 직접 push 안 함)</w:t>
+      </w:r>
+    </w:p>
+    <w:p>
+      <w:pPr>
+        <w:spacing w:after="60" w:before="160"/>
+      </w:pPr>
+      <w:r>
+        <w:rPr>
+          <w:rFonts w:ascii="Malgun Gothic" w:cs="Malgun Gothic" w:eastAsia="Malgun Gothic" w:hAnsi="Malgun Gothic"/>
+          <w:b/>
+          <w:bCs/>
+          <w:color w:val="246BFD"/>
+          <w:sz w:val="21"/>
+          <w:szCs w:val="21"/>
+        </w:rPr>
+        <w:t xml:space="preserve">남은 일 / 결정 필요</w:t>
+      </w:r>
+    </w:p>
+    <w:p>
+      <w:pPr>
+        <w:pStyle w:val="ListParagraph"/>
+        <w:numPr>
+          <w:ilvl w:val="0"/>
+          <w:numId w:val="2"/>
+        </w:numPr>
+        <w:spacing w:after="40"/>
+      </w:pPr>
+      <w:r>
+        <w:rPr>
+          <w:rFonts w:ascii="Malgun Gothic" w:cs="Malgun Gothic" w:eastAsia="Malgun Gothic" w:hAnsi="Malgun Gothic"/>
+          <w:color w:val="132238"/>
+          <w:sz w:val="20"/>
+          <w:szCs w:val="20"/>
+        </w:rPr>
+        <w:t xml:space="preserve">팀 레포에 subtree add·브랜치 push·PR (사용자 허락 후)</w:t>
+      </w:r>
+    </w:p>
+    <w:p>
+      <w:pPr>
+        <w:pStyle w:val="ListParagraph"/>
+        <w:numPr>
+          <w:ilvl w:val="0"/>
+          <w:numId w:val="2"/>
+        </w:numPr>
+        <w:spacing w:after="40"/>
+      </w:pPr>
+      <w:r>
+        <w:rPr>
+          <w:rFonts w:ascii="Malgun Gothic" w:cs="Malgun Gothic" w:eastAsia="Malgun Gothic" w:hAnsi="Malgun Gothic"/>
+          <w:color w:val="132238"/>
+          <w:sz w:val="20"/>
+          <w:szCs w:val="20"/>
+        </w:rPr>
+        <w:t xml:space="preserve">합친 뒤 작업 흐름(팀 레포 mobile/에서 개발 vs 앱 레포 유지) 결정</w:t>
+      </w:r>
+    </w:p>
+    <w:p>
+      <w:pPr>
+        <w:pStyle w:val="ListParagraph"/>
+        <w:numPr>
+          <w:ilvl w:val="0"/>
+          <w:numId w:val="2"/>
+        </w:numPr>
+        <w:spacing w:after="40"/>
+      </w:pPr>
+      <w:r>
+        <w:rPr>
+          <w:rFonts w:ascii="Malgun Gothic" w:cs="Malgun Gothic" w:eastAsia="Malgun Gothic" w:hAnsi="Malgun Gothic"/>
+          <w:color w:val="132238"/>
+          <w:sz w:val="20"/>
+          <w:szCs w:val="20"/>
+        </w:rPr>
+        <w:t xml:space="preserve">AI 서버 API와 앱 입력·출력 차이(area, 분위기·날짜, 제외 목록, 이동 정보, 최대 6곳, 600초 대기) 팀 합의</w:t>
       </w:r>
     </w:p>
     <w:sectPr>

</xml_diff>